<commit_message>
chore: update knowledge base, resume library, and portfolio files
</commit_message>
<xml_diff>
--- a/RESUME_LIBRARY/DEMAND.docx
+++ b/RESUME_LIBRARY/DEMAND.docx
@@ -20,7 +20,7 @@
     </w:p>
     <w:p>
       <w:pPr>
-        <w:spacing w:before="0" w:after="80" w:line="240" w:lineRule="auto"/>
+        <w:spacing w:before="0" w:after="60" w:line="240" w:lineRule="auto"/>
         <w:jc w:val="center"/>
       </w:pPr>
       <w:r>
@@ -44,7 +44,7 @@
           <w:rFonts w:ascii="Calibri" w:hAnsi="Calibri"/>
           <w:b/>
           <w:i w:val="0"/>
-          <w:color w:val="555555"/>
+          <w:color w:val="333333"/>
           <w:sz w:val="18"/>
         </w:rPr>
         <w:t>Open to Relocation  |  Open to Remote Opportunities</w:t>
@@ -119,7 +119,7 @@
           <w:color w:val="333333"/>
           <w:sz w:val="20"/>
         </w:rPr>
-        <w:t xml:space="preserve">, including </w:t>
+        <w:t xml:space="preserve"> driving </w:t>
       </w:r>
       <w:r>
         <w:rPr>
@@ -129,7 +129,7 @@
           <w:color w:val="333333"/>
           <w:sz w:val="20"/>
         </w:rPr>
-        <w:t>15 years in dedicated demand generation, growth marketing, and pipeline growth leadership</w:t>
+        <w:t>pipeline acceleration</w:t>
       </w:r>
       <w:r>
         <w:rPr>
@@ -139,7 +139,7 @@
           <w:color w:val="333333"/>
           <w:sz w:val="20"/>
         </w:rPr>
-        <w:t xml:space="preserve">, driving </w:t>
+        <w:t xml:space="preserve">, </w:t>
       </w:r>
       <w:r>
         <w:rPr>
@@ -149,7 +149,27 @@
           <w:color w:val="333333"/>
           <w:sz w:val="20"/>
         </w:rPr>
-        <w:t>pipeline acceleration, ABM, and revenue marketing</w:t>
+        <w:t>ABM</w:t>
+      </w:r>
+      <w:r>
+        <w:rPr>
+          <w:rFonts w:ascii="Calibri" w:hAnsi="Calibri"/>
+          <w:b w:val="0"/>
+          <w:i w:val="0"/>
+          <w:color w:val="333333"/>
+          <w:sz w:val="20"/>
+        </w:rPr>
+        <w:t xml:space="preserve">, and </w:t>
+      </w:r>
+      <w:r>
+        <w:rPr>
+          <w:rFonts w:ascii="Calibri" w:hAnsi="Calibri"/>
+          <w:b/>
+          <w:i w:val="0"/>
+          <w:color w:val="333333"/>
+          <w:sz w:val="20"/>
+        </w:rPr>
+        <w:t>revenue marketing</w:t>
       </w:r>
       <w:r>
         <w:rPr>
@@ -179,47 +199,7 @@
           <w:color w:val="333333"/>
           <w:sz w:val="20"/>
         </w:rPr>
-        <w:t xml:space="preserve"> and technology organizations. Proven track record building </w:t>
-      </w:r>
-      <w:r>
-        <w:rPr>
-          <w:rFonts w:ascii="Calibri" w:hAnsi="Calibri"/>
-          <w:b/>
-          <w:i w:val="0"/>
-          <w:color w:val="333333"/>
-          <w:sz w:val="20"/>
-        </w:rPr>
-        <w:t>scalable demand engines, driving customer acquisition, and improving conversion</w:t>
-      </w:r>
-      <w:r>
-        <w:rPr>
-          <w:rFonts w:ascii="Calibri" w:hAnsi="Calibri"/>
-          <w:b w:val="0"/>
-          <w:i w:val="0"/>
-          <w:color w:val="333333"/>
-          <w:sz w:val="20"/>
-        </w:rPr>
-        <w:t xml:space="preserve">, and aligning marketing investment with measurable </w:t>
-      </w:r>
-      <w:r>
-        <w:rPr>
-          <w:rFonts w:ascii="Calibri" w:hAnsi="Calibri"/>
-          <w:b/>
-          <w:i w:val="0"/>
-          <w:color w:val="333333"/>
-          <w:sz w:val="20"/>
-        </w:rPr>
-        <w:t>pipeline and revenue outcomes</w:t>
-      </w:r>
-      <w:r>
-        <w:rPr>
-          <w:rFonts w:ascii="Calibri" w:hAnsi="Calibri"/>
-          <w:b w:val="0"/>
-          <w:i w:val="0"/>
-          <w:color w:val="333333"/>
-          <w:sz w:val="20"/>
-        </w:rPr>
-        <w:t>.</w:t>
+        <w:t xml:space="preserve"> and technology organizations. Proven track record building scalable demand engines, driving customer acquisition, and improving conversion, and aligning marketing investment with measurable pipeline and revenue outcomes.</w:t>
       </w:r>
     </w:p>
     <w:p>
@@ -625,7 +605,7 @@
           <w:color w:val="1F3864"/>
           <w:sz w:val="22"/>
         </w:rPr>
-        <w:t>Keysight Technologies Ltd</w:t>
+        <w:t>CIVICA UK Ltd</w:t>
       </w:r>
       <w:r>
         <w:rPr>
@@ -635,7 +615,7 @@
           <w:color w:val="555555"/>
           <w:sz w:val="20"/>
         </w:rPr>
-        <w:t xml:space="preserve">  |  GLOBAL MARKETING HEAD – DIGITAL &amp; GROWTH</w:t>
+        <w:t xml:space="preserve">  |  GLOBAL ABM &amp; MARKETING AUTOMATION</w:t>
       </w:r>
       <w:r>
         <w:rPr>
@@ -646,7 +626,74 @@
           <w:sz w:val="18"/>
         </w:rPr>
         <w:tab/>
-        <w:t>Jul 2024 – Present</w:t>
+        <w:t>Aug 2026 – Present</w:t>
+      </w:r>
+    </w:p>
+    <w:p>
+      <w:pPr>
+        <w:pStyle w:val="ListBullet"/>
+        <w:spacing w:before="0" w:after="30" w:line="240" w:lineRule="auto"/>
+        <w:ind w:left="274" w:hanging="274"/>
+      </w:pPr>
+      <w:r>
+        <w:rPr>
+          <w:rFonts w:ascii="Calibri" w:hAnsi="Calibri"/>
+          <w:b/>
+          <w:i w:val="0"/>
+          <w:color w:val="333333"/>
+          <w:sz w:val="20"/>
+        </w:rPr>
+        <w:t>Lead ABM strategy and Demandbase adoption</w:t>
+      </w:r>
+      <w:r>
+        <w:rPr>
+          <w:rFonts w:ascii="Calibri" w:hAnsi="Calibri"/>
+          <w:b w:val="0"/>
+          <w:i w:val="0"/>
+          <w:color w:val="333333"/>
+          <w:sz w:val="20"/>
+        </w:rPr>
+        <w:t xml:space="preserve"> across Sales, activating </w:t>
+      </w:r>
+      <w:r>
+        <w:rPr>
+          <w:rFonts w:ascii="Calibri" w:hAnsi="Calibri"/>
+          <w:b/>
+          <w:i w:val="0"/>
+          <w:color w:val="333333"/>
+          <w:sz w:val="20"/>
+        </w:rPr>
+        <w:t>1:1, 1:Few, and 1:Many</w:t>
+      </w:r>
+      <w:r>
+        <w:rPr>
+          <w:rFonts w:ascii="Calibri" w:hAnsi="Calibri"/>
+          <w:b w:val="0"/>
+          <w:i w:val="0"/>
+          <w:color w:val="333333"/>
+          <w:sz w:val="20"/>
+        </w:rPr>
+        <w:t xml:space="preserve"> account tiers to lift conversions </w:t>
+      </w:r>
+      <w:r>
+        <w:rPr>
+          <w:rFonts w:ascii="Calibri" w:hAnsi="Calibri"/>
+          <w:b/>
+          <w:i w:val="0"/>
+          <w:color w:val="333333"/>
+          <w:sz w:val="20"/>
+        </w:rPr>
+        <w:t>20%</w:t>
+      </w:r>
+      <w:r>
+        <w:rPr>
+          <w:rFonts w:ascii="Calibri" w:hAnsi="Calibri"/>
+          <w:b w:val="0"/>
+          <w:i w:val="0"/>
+          <w:color w:val="333333"/>
+          <w:sz w:val="20"/>
+        </w:rPr>
+        <w:t>.</w:t>
       </w:r>
     </w:p>
     <w:p>
@@ -663,7 +710,37 @@
           <w:color w:val="333333"/>
           <w:sz w:val="20"/>
         </w:rPr>
-        <w:t>Drive demand generation, growth marketing, and pipeline acceleration initiatives across India and the broader APJC region.</w:t>
+        <w:t>Drive marketing automation via Salesforce Marketing Cloud</w:t>
+      </w:r>
+      <w:r>
+        <w:rPr>
+          <w:rFonts w:ascii="Calibri" w:hAnsi="Calibri"/>
+          <w:b w:val="0"/>
+          <w:i w:val="0"/>
+          <w:color w:val="333333"/>
+          <w:sz w:val="20"/>
+        </w:rPr>
+        <w:t xml:space="preserve"> in partnership with RevOps, with focused scaling across </w:t>
+      </w:r>
+      <w:r>
+        <w:rPr>
+          <w:rFonts w:ascii="Calibri" w:hAnsi="Calibri"/>
+          <w:b/>
+          <w:i w:val="0"/>
+          <w:color w:val="333333"/>
+          <w:sz w:val="20"/>
+        </w:rPr>
+        <w:t>North America and APAC</w:t>
+      </w:r>
+      <w:r>
+        <w:rPr>
+          <w:rFonts w:ascii="Calibri" w:hAnsi="Calibri"/>
+          <w:b w:val="0"/>
+          <w:i w:val="0"/>
+          <w:color w:val="333333"/>
+          <w:sz w:val="20"/>
+        </w:rPr>
+        <w:t>.</w:t>
       </w:r>
     </w:p>
     <w:p>
@@ -680,7 +757,90 @@
           <w:color w:val="333333"/>
           <w:sz w:val="20"/>
         </w:rPr>
-        <w:t xml:space="preserve">Manage </w:t>
+        <w:t>Boost marketing pipeline through AI-powered lifecycle journeys</w:t>
+      </w:r>
+      <w:r>
+        <w:rPr>
+          <w:rFonts w:ascii="Calibri" w:hAnsi="Calibri"/>
+          <w:b w:val="0"/>
+          <w:i w:val="0"/>
+          <w:color w:val="333333"/>
+          <w:sz w:val="20"/>
+        </w:rPr>
+        <w:t>, activating offline-to-online nurture aligned with sales sprint motions.</w:t>
+      </w:r>
+    </w:p>
+    <w:p>
+      <w:pPr>
+        <w:tabs>
+          <w:tab w:pos="10800" w:val="right"/>
+        </w:tabs>
+        <w:spacing w:before="130" w:after="30" w:line="240" w:lineRule="auto"/>
+      </w:pPr>
+      <w:r>
+        <w:rPr>
+          <w:rFonts w:ascii="Calibri" w:hAnsi="Calibri"/>
+          <w:b/>
+          <w:i w:val="0"/>
+          <w:color w:val="1F3864"/>
+          <w:sz w:val="22"/>
+        </w:rPr>
+        <w:t>Keysight Technologies Ltd</w:t>
+      </w:r>
+      <w:r>
+        <w:rPr>
+          <w:rFonts w:ascii="Calibri" w:hAnsi="Calibri"/>
+          <w:b w:val="0"/>
+          <w:i/>
+          <w:color w:val="555555"/>
+          <w:sz w:val="20"/>
+        </w:rPr>
+        <w:t xml:space="preserve">  |  GLOBAL DIGITAL MARKETING (Americas, Europe &amp; APJC)</w:t>
+      </w:r>
+      <w:r>
+        <w:rPr>
+          <w:rFonts w:ascii="Calibri" w:hAnsi="Calibri"/>
+          <w:b w:val="0"/>
+          <w:i/>
+          <w:color w:val="555555"/>
+          <w:sz w:val="18"/>
+        </w:rPr>
+        <w:tab/>
+        <w:t>Jul 2024 – Mar 2026</w:t>
+      </w:r>
+    </w:p>
+    <w:p>
+      <w:pPr>
+        <w:pStyle w:val="ListBullet"/>
+        <w:spacing w:before="0" w:after="30" w:line="240" w:lineRule="auto"/>
+        <w:ind w:left="274" w:hanging="274"/>
+      </w:pPr>
+      <w:r>
+        <w:rPr>
+          <w:rFonts w:ascii="Calibri" w:hAnsi="Calibri"/>
+          <w:b w:val="0"/>
+          <w:i w:val="0"/>
+          <w:color w:val="333333"/>
+          <w:sz w:val="20"/>
+        </w:rPr>
+        <w:t>Drove demand generation, growth marketing, and pipeline acceleration initiatives across India and the broader APJC region.</w:t>
+      </w:r>
+    </w:p>
+    <w:p>
+      <w:pPr>
+        <w:pStyle w:val="ListBullet"/>
+        <w:spacing w:before="0" w:after="30" w:line="240" w:lineRule="auto"/>
+        <w:ind w:left="274" w:hanging="274"/>
+      </w:pPr>
+      <w:r>
+        <w:rPr>
+          <w:rFonts w:ascii="Calibri" w:hAnsi="Calibri"/>
+          <w:b w:val="0"/>
+          <w:i w:val="0"/>
+          <w:color w:val="333333"/>
+          <w:sz w:val="20"/>
+        </w:rPr>
+        <w:t xml:space="preserve">Managed </w:t>
       </w:r>
       <w:r>
         <w:rPr>
@@ -717,7 +877,7 @@
           <w:color w:val="333333"/>
           <w:sz w:val="20"/>
         </w:rPr>
-        <w:t>Own marketing automation, lead scoring, and routing frameworks aligned with sales priorities.</w:t>
+        <w:t>Owned marketing automation, lead scoring, and routing frameworks aligned with sales priorities.</w:t>
       </w:r>
     </w:p>
     <w:p>
@@ -734,7 +894,7 @@
           <w:color w:val="333333"/>
           <w:sz w:val="20"/>
         </w:rPr>
-        <w:t>Lead marketing analytics, attribution, and executive pipeline reporting.</w:t>
+        <w:t>Led marketing analytics, attribution, and executive pipeline reporting.</w:t>
       </w:r>
     </w:p>
     <w:p>
@@ -751,7 +911,7 @@
           <w:color w:val="333333"/>
           <w:sz w:val="20"/>
         </w:rPr>
-        <w:t>Partner with Sales and Regional Marketing to align demand generation programs with revenue priorities.</w:t>
+        <w:t>Partnered with Sales and Regional Marketing to align demand generation programs with revenue priorities.</w:t>
       </w:r>
     </w:p>
     <w:p>
@@ -768,7 +928,7 @@
           <w:color w:val="333333"/>
           <w:sz w:val="20"/>
         </w:rPr>
-        <w:t>Drive AI adoption across demand generation workflows, improving execution speed and scalability.</w:t>
+        <w:t>Drove AI adoption across demand generation workflows, improving execution speed and scalability.</w:t>
       </w:r>
     </w:p>
     <w:p>
@@ -1086,27 +1246,7 @@
           <w:color w:val="333333"/>
           <w:sz w:val="20"/>
         </w:rPr>
-        <w:t xml:space="preserve">; ran the </w:t>
-      </w:r>
-      <w:r>
-        <w:rPr>
-          <w:rFonts w:ascii="Calibri" w:hAnsi="Calibri"/>
-          <w:b/>
-          <w:i w:val="0"/>
-          <w:color w:val="333333"/>
-          <w:sz w:val="20"/>
-        </w:rPr>
-        <w:t>Cisco Interaction Network webinar series</w:t>
-      </w:r>
-      <w:r>
-        <w:rPr>
-          <w:rFonts w:ascii="Calibri" w:hAnsi="Calibri"/>
-          <w:b w:val="0"/>
-          <w:i w:val="0"/>
-          <w:color w:val="333333"/>
-          <w:sz w:val="20"/>
-        </w:rPr>
-        <w:t>, engaging 1,000 IT decision-makers and influencers monthly for 5 years.</w:t>
+        <w:t>; ran the Cisco Interaction Network webinar series, engaging 1,000 IT decision-makers and influencers monthly for 5 years.</w:t>
       </w:r>
     </w:p>
     <w:p>
@@ -1186,14 +1326,16 @@
     </w:p>
     <w:p>
       <w:pPr>
-        <w:spacing w:before="0" w:after="70" w:line="240" w:lineRule="auto"/>
+        <w:pStyle w:val="ListBullet"/>
+        <w:spacing w:before="0" w:after="30" w:line="240" w:lineRule="auto"/>
+        <w:ind w:left="274" w:hanging="274"/>
       </w:pPr>
       <w:r>
         <w:rPr>
           <w:rFonts w:ascii="Calibri" w:hAnsi="Calibri"/>
           <w:b/>
           <w:i w:val="0"/>
-          <w:color w:val="1F3864"/>
+          <w:color w:val="333333"/>
           <w:sz w:val="20"/>
         </w:rPr>
         <w:t xml:space="preserve">Demand Generation &amp; Growth Engine: </w:t>
@@ -1271,14 +1413,16 @@
     </w:p>
     <w:p>
       <w:pPr>
-        <w:spacing w:before="0" w:after="70" w:line="240" w:lineRule="auto"/>
+        <w:pStyle w:val="ListBullet"/>
+        <w:spacing w:before="0" w:after="30" w:line="240" w:lineRule="auto"/>
+        <w:ind w:left="274" w:hanging="274"/>
       </w:pPr>
       <w:r>
         <w:rPr>
           <w:rFonts w:ascii="Calibri" w:hAnsi="Calibri"/>
           <w:b/>
           <w:i w:val="0"/>
-          <w:color w:val="1F3864"/>
+          <w:color w:val="333333"/>
           <w:sz w:val="20"/>
         </w:rPr>
         <w:t xml:space="preserve">ABM Programs: </w:t>
@@ -1316,14 +1460,16 @@
     </w:p>
     <w:p>
       <w:pPr>
-        <w:spacing w:before="0" w:after="70" w:line="240" w:lineRule="auto"/>
+        <w:pStyle w:val="ListBullet"/>
+        <w:spacing w:before="0" w:after="30" w:line="240" w:lineRule="auto"/>
+        <w:ind w:left="274" w:hanging="274"/>
       </w:pPr>
       <w:r>
         <w:rPr>
           <w:rFonts w:ascii="Calibri" w:hAnsi="Calibri"/>
           <w:b/>
           <w:i w:val="0"/>
-          <w:color w:val="1F3864"/>
+          <w:color w:val="333333"/>
           <w:sz w:val="20"/>
         </w:rPr>
         <w:t xml:space="preserve">B2B Ecommerce: </w:t>
@@ -1381,14 +1527,16 @@
     </w:p>
     <w:p>
       <w:pPr>
-        <w:spacing w:before="0" w:after="70" w:line="240" w:lineRule="auto"/>
+        <w:pStyle w:val="ListBullet"/>
+        <w:spacing w:before="0" w:after="30" w:line="240" w:lineRule="auto"/>
+        <w:ind w:left="274" w:hanging="274"/>
       </w:pPr>
       <w:r>
         <w:rPr>
           <w:rFonts w:ascii="Calibri" w:hAnsi="Calibri"/>
           <w:b/>
           <w:i w:val="0"/>
-          <w:color w:val="1F3864"/>
+          <w:color w:val="333333"/>
           <w:sz w:val="20"/>
         </w:rPr>
         <w:t xml:space="preserve">Partner Marketplace Program: </w:t>
@@ -1708,7 +1856,7 @@
           <w:color w:val="333333"/>
           <w:sz w:val="20"/>
         </w:rPr>
-        <w:t>Salesforce CRM | Oracle Eloqua | Marketo Engage | HubSpot</w:t>
+        <w:t>Salesforce CRM | Salesforce Marketing Cloud | Oracle Eloqua | Marketo Engage | HubSpot</w:t>
       </w:r>
     </w:p>
     <w:p>
@@ -1846,7 +1994,7 @@
     </w:p>
     <w:p>
       <w:pPr>
-        <w:spacing w:before="0" w:after="70" w:line="240" w:lineRule="auto"/>
+        <w:spacing w:before="0" w:after="120" w:line="240" w:lineRule="auto"/>
       </w:pPr>
       <w:r>
         <w:rPr>
@@ -1856,7 +2004,7 @@
           <w:color w:val="555555"/>
           <w:sz w:val="20"/>
         </w:rPr>
-        <w:t>Skill India – Government of India | Mar 2026</w:t>
+        <w:t>Outskill | Apr 2026</w:t>
       </w:r>
     </w:p>
     <w:p>
@@ -1876,7 +2024,7 @@
     </w:p>
     <w:p>
       <w:pPr>
-        <w:spacing w:before="0" w:after="0" w:line="240" w:lineRule="auto"/>
+        <w:spacing w:before="0" w:after="120" w:line="240" w:lineRule="auto"/>
       </w:pPr>
       <w:r>
         <w:rPr>

</xml_diff>